<commit_message>
Ya funciona el scroll + desplegables
</commit_message>
<xml_diff>
--- a/Documentación/DanielCristinaDoris_ANTEPROYECTO.docx
+++ b/Documentación/DanielCristinaDoris_ANTEPROYECTO.docx
@@ -212,25 +212,19 @@
         <w:t>Cristina Ouellette</w:t>
       </w:r>
     </w:p>
-    <w:p>
-      <w:r>
-        <w:lastRenderedPageBreak/>
-        <w:br w:type="page"/>
-      </w:r>
-    </w:p>
-    <w:p>
-      <w:pPr>
-        <w:rPr>
-          <w:b/>
-          <w:bCs/>
-        </w:rPr>
-      </w:pPr>
-      <w:r>
-        <w:rPr>
-          <w:b/>
-          <w:bCs/>
-        </w:rPr>
-        <w:lastRenderedPageBreak/>
+    <w:p/>
+    <w:p>
+      <w:pPr>
+        <w:rPr>
+          <w:b/>
+          <w:bCs/>
+        </w:rPr>
+      </w:pPr>
+      <w:r>
+        <w:rPr>
+          <w:b/>
+          <w:bCs/>
+        </w:rPr>
         <w:t>Descripción del Proyecto</w:t>
       </w:r>
     </w:p>
@@ -250,15 +244,7 @@
       </w:r>
       <w:proofErr w:type="spellEnd"/>
       <w:r>
-        <w:t xml:space="preserve"> es una plataforma web diseñada específicamente para la comunidad artística. El objetivo principal es crear un ecosistema dinámico donde artistas de diversas disciplinas (dibujo digital, fotografía, ilustración, etc.) puedan compartir su </w:t>
-      </w:r>
-      <w:proofErr w:type="gramStart"/>
-      <w:r>
-        <w:t>portfolio</w:t>
-      </w:r>
-      <w:proofErr w:type="gramEnd"/>
-      <w:r>
-        <w:t>, interactuar con otros creadores y encontrar inspiración. La aplicación actúa como un punto de encuentro que combina las capacidades de un banco de imágenes con funciones sociale</w:t>
+        <w:t xml:space="preserve"> es una plataforma web diseñada específicamente para la comunidad artística. El objetivo principal es crear un ecosistema dinámico donde artistas de diversas disciplinas (dibujo digital, fotografía, ilustración, etc.) puedan compartir su portfolio, interactuar con otros creadores y encontrar inspiración. La aplicación actúa como un punto de encuentro que combina las capacidades de un banco de imágenes con funciones sociale</w:t>
       </w:r>
       <w:r>
         <w:t>s</w:t>
@@ -438,6 +424,7 @@
           <w:b/>
           <w:bCs/>
         </w:rPr>
+        <w:lastRenderedPageBreak/>
         <w:t>Búsqueda Avanzada:</w:t>
       </w:r>
       <w:r>

</xml_diff>